<commit_message>
Update PlanterAid project period
</commit_message>
<xml_diff>
--- a/portfolio-content/cv/Vincent-Trayvilla-Final-CV.docx
+++ b/portfolio-content/cv/Vincent-Trayvilla-Final-CV.docx
@@ -4,7 +4,7 @@
   <w:body>
     <w:p>
       <w:pPr>
-        <w:spacing w:after="10" w:before="0"/>
+        <w:spacing w:after="10"/>
         <w:jc w:val="center"/>
       </w:pPr>
       <w:r>
@@ -17,7 +17,7 @@
     </w:p>
     <w:p>
       <w:pPr>
-        <w:spacing w:after="18" w:before="0"/>
+        <w:spacing w:after="18"/>
         <w:jc w:val="center"/>
       </w:pPr>
       <w:r>
@@ -29,34 +29,22 @@
     </w:p>
     <w:p>
       <w:pPr>
-        <w:spacing w:after="4" w:before="0"/>
+        <w:spacing w:after="4"/>
         <w:jc w:val="center"/>
       </w:pPr>
       <w:r>
-        <w:rPr>
-          <w:sz w:val="20"/>
-          <w:szCs w:val="20"/>
-        </w:rPr>
         <w:t>San Pedro City, Laguna</w:t>
       </w:r>
       <w:r>
-        <w:rPr>
-          <w:sz w:val="20"/>
-          <w:szCs w:val="20"/>
-        </w:rPr>
         <w:t xml:space="preserve">  |  +63 994 997 5241  |  vince.trayvilla@gmail.com</w:t>
       </w:r>
     </w:p>
     <w:p>
       <w:pPr>
-        <w:spacing w:after="12" w:before="0"/>
+        <w:spacing w:after="12"/>
         <w:jc w:val="center"/>
       </w:pPr>
       <w:r>
-        <w:rPr>
-          <w:sz w:val="20"/>
-          <w:szCs w:val="20"/>
-        </w:rPr>
         <w:t>linkedin.com/in/vincent-harry-trayvilla  |  github.com/vincent-harry  |  vhhtrayvilla-portfolio.vercel.app</w:t>
       </w:r>
     </w:p>
@@ -78,12 +66,9 @@
     </w:p>
     <w:p>
       <w:pPr>
-        <w:spacing w:after="20" w:line="240" w:lineRule="auto"/>
+        <w:spacing w:after="20"/>
       </w:pPr>
       <w:r>
-        <w:rPr>
-          <w:sz w:val="20"/>
-        </w:rPr>
         <w:t>Graduating Bachelor of Science in Information Technology student with hands-on practicum experience as a Web Systems Developer and IT Support Intern in a local government environment. Skilled in web-based information systems, database work, system testing, documentation, user support, basic networking, and software and hardware troubleshooting. Seeking an entry-level role in IT support, systems development, quality assurance, or web applications.</w:t>
       </w:r>
     </w:p>
@@ -146,7 +131,6 @@
             <w:r>
               <w:rPr>
                 <w:b/>
-                <w:sz w:val="20"/>
               </w:rPr>
               <w:t>CITY GOVERNMENT OF BIÑAN</w:t>
             </w:r>
@@ -174,7 +158,6 @@
             <w:r>
               <w:rPr>
                 <w:b/>
-                <w:sz w:val="20"/>
               </w:rPr>
               <w:t>Web Systems Developer and IT Support Intern</w:t>
             </w:r>
@@ -197,7 +180,7 @@
               <w:jc w:val="right"/>
             </w:pPr>
             <w:r>
-              <w:t xml:space="preserve">Apr 2026 – Jul 2026</w:t>
+              <w:t>Apr 2026 – Jul 2026</w:t>
             </w:r>
           </w:p>
         </w:tc>
@@ -205,99 +188,77 @@
     </w:tbl>
     <w:p>
       <w:pPr>
-        <w:spacing w:after="20" w:line="240" w:lineRule="auto"/>
+        <w:spacing w:after="20"/>
         <w:ind w:left="43"/>
       </w:pPr>
       <w:r>
         <w:rPr>
           <w:b/>
-          <w:sz w:val="20"/>
         </w:rPr>
         <w:t xml:space="preserve">Assigned Project: </w:t>
       </w:r>
       <w:r>
-        <w:rPr>
-          <w:sz w:val="20"/>
-        </w:rPr>
         <w:t>Biñan Access Card Management Information System</w:t>
       </w:r>
     </w:p>
     <w:p>
       <w:pPr>
         <w:pStyle w:val="ListBullet"/>
-        <w:spacing w:after="20" w:line="240" w:lineRule="auto"/>
+        <w:spacing w:after="20"/>
         <w:ind w:left="230" w:hanging="187"/>
       </w:pPr>
       <w:r>
-        <w:rPr>
-          <w:sz w:val="20"/>
-        </w:rPr>
-        <w:t xml:space="preserve">Contributed to the Biñan Access Card Management Information System using CodeIgniter 4, PHP, MySQL, Bootstrap, jQuery, and Ajax.</w:t>
+        <w:t>Contributed to the Biñan Access Card Management Information System using CodeIgniter 4, PHP, MySQL, Bootstrap, jQuery, and Ajax.</w:t>
       </w:r>
     </w:p>
     <w:p>
       <w:pPr>
         <w:pStyle w:val="ListBullet"/>
-        <w:spacing w:after="20" w:line="240" w:lineRule="auto"/>
+        <w:spacing w:after="20"/>
         <w:ind w:left="230" w:hanging="187"/>
       </w:pPr>
       <w:r>
-        <w:rPr>
-          <w:sz w:val="20"/>
-        </w:rPr>
-        <w:t xml:space="preserve">Assisted with system models, database updates, data validation, testing, documentation, and Git-based team collaboration.</w:t>
+        <w:t>Assisted with system models, database updates, data validation, testing, documentation, and Git-based team collaboration.</w:t>
       </w:r>
     </w:p>
     <w:p>
       <w:pPr>
         <w:pStyle w:val="ListBullet"/>
-        <w:spacing w:after="20" w:line="240" w:lineRule="auto"/>
+        <w:spacing w:after="20"/>
         <w:ind w:left="230" w:hanging="187"/>
       </w:pPr>
       <w:r>
-        <w:rPr>
-          <w:sz w:val="20"/>
-        </w:rPr>
-        <w:t xml:space="preserve">Provided IT support involving Windows, XAMPP, Apache, MySQL, phpMyAdmin, development-environment configuration, and basic hardware and software troubleshooting.</w:t>
+        <w:t>Provided IT support involving Windows, XAMPP, Apache, MySQL, phpMyAdmin, development-environment configuration, and basic hardware and software troubleshooting.</w:t>
       </w:r>
     </w:p>
     <w:p>
       <w:pPr>
         <w:pStyle w:val="ListBullet"/>
-        <w:spacing w:after="20" w:line="240" w:lineRule="auto"/>
+        <w:spacing w:after="20"/>
         <w:ind w:left="230" w:hanging="187"/>
       </w:pPr>
       <w:r>
-        <w:rPr>
-          <w:sz w:val="20"/>
-        </w:rPr>
-        <w:t xml:space="preserve">Assisted with basic network setup and troubleshooting, including LAN connectivity, Ethernet cable checks, IP address configuration, and internet-access support for office workstations.</w:t>
+        <w:t>Assisted with basic network setup and troubleshooting, including LAN connectivity, Ethernet cable checks, IP address configuration, and internet-access support for office workstations.</w:t>
       </w:r>
     </w:p>
     <w:p>
       <w:pPr>
         <w:pStyle w:val="ListBullet"/>
-        <w:spacing w:after="20" w:line="240" w:lineRule="auto"/>
+        <w:spacing w:after="20"/>
         <w:ind w:left="230" w:hanging="187"/>
       </w:pPr>
       <w:r>
-        <w:rPr>
-          <w:sz w:val="20"/>
-        </w:rPr>
-        <w:t xml:space="preserve">Supported the live deployment of the Biñan Access Card system during a three-day rice subsidy distribution. The system used QR-code scanning and validation to confirm beneficiary eligibility before releasing approximately 25,000 sacks of rice across 18 barangays, serving six barangays per day.</w:t>
+        <w:t>Supported the live deployment of the Biñan Access Card system during a three-day rice subsidy distribution. The system used QR-code scanning and validation to confirm beneficiary eligibility before releasing approximately 25,000 sacks of rice across 18 barangays, serving six barangays per day.</w:t>
       </w:r>
     </w:p>
     <w:p>
       <w:pPr>
         <w:pStyle w:val="ListBullet"/>
-        <w:spacing w:after="20" w:line="240" w:lineRule="auto"/>
+        <w:spacing w:after="20"/>
         <w:ind w:left="230" w:hanging="187"/>
       </w:pPr>
       <w:r>
-        <w:rPr>
-          <w:sz w:val="20"/>
-        </w:rPr>
-        <w:t xml:space="preserve">Assisted distribution personnel and users during on-site operations through QR-code verification, beneficiary validation, scanner support, and basic system troubleshooting.</w:t>
+        <w:t>Assisted distribution personnel and users during on-site operations through QR-code verification, beneficiary validation, scanner support, and basic system troubleshooting.</w:t>
       </w:r>
     </w:p>
     <w:p>
@@ -313,7 +274,7 @@
           <w:b/>
           <w:sz w:val="22"/>
         </w:rPr>
-        <w:t xml:space="preserve">ACADEMIC PROJECTS AND RESEARCH</w:t>
+        <w:t>ACADEMIC PROJECTS AND RESEARCH</w:t>
       </w:r>
     </w:p>
     <w:tbl>
@@ -359,7 +320,6 @@
             <w:r>
               <w:rPr>
                 <w:b/>
-                <w:sz w:val="20"/>
               </w:rPr>
               <w:t>PLANTERAID</w:t>
             </w:r>
@@ -391,7 +351,6 @@
             <w:r>
               <w:rPr>
                 <w:b/>
-                <w:sz w:val="20"/>
               </w:rPr>
               <w:t>Capstone Project</w:t>
             </w:r>
@@ -414,7 +373,7 @@
               <w:jc w:val="right"/>
             </w:pPr>
             <w:r>
-              <w:t>2025 - 2026</w:t>
+              <w:t>Aug 2025 - Jul 2026</w:t>
             </w:r>
           </w:p>
         </w:tc>
@@ -423,27 +382,21 @@
     <w:p>
       <w:pPr>
         <w:pStyle w:val="ListBullet"/>
-        <w:spacing w:after="20" w:line="240" w:lineRule="auto"/>
+        <w:spacing w:after="20"/>
         <w:ind w:left="230" w:hanging="187"/>
       </w:pPr>
       <w:r>
-        <w:rPr>
-          <w:sz w:val="20"/>
-        </w:rPr>
-        <w:t xml:space="preserve">Developed an IoT-enabled web-based soil monitoring and recommendation system designed to monitor soil moisture, temperature, humidity, and location data and provide recommendations that support field decisions.</w:t>
+        <w:t>Developed an IoT-enabled web-based soil monitoring and recommendation system designed to monitor soil moisture, temperature, humidity, and location data and provide recommendations that support field decisions.</w:t>
       </w:r>
     </w:p>
     <w:p>
       <w:pPr>
         <w:pStyle w:val="ListBullet"/>
-        <w:spacing w:after="20" w:line="240" w:lineRule="auto"/>
+        <w:spacing w:after="20"/>
         <w:ind w:left="230" w:hanging="187"/>
       </w:pPr>
       <w:r>
-        <w:rPr>
-          <w:sz w:val="20"/>
-        </w:rPr>
-        <w:t xml:space="preserve">Technology stack: C#, Blazor .NET Core 8.0, HTML, CSS, JavaScript, SQL Server, SQL Server Management Studio, Arduino IDE, ESP32/Lolin32, soil-moisture sensor, SHT31 temperature and humidity sensor, and GPS integration.</w:t>
+        <w:t>Technology stack: C#, Blazor .NET Core 8.0, HTML, CSS, JavaScript, SQL Server, SQL Server Management Studio, Arduino IDE, ESP32/Lolin32, soil-moisture sensor, SHT31 temperature and humidity sensor, and GPS integration.</w:t>
       </w:r>
     </w:p>
     <w:tbl>
@@ -489,7 +442,6 @@
             <w:r>
               <w:rPr>
                 <w:b/>
-                <w:sz w:val="20"/>
               </w:rPr>
               <w:t>E-COMMERCE TICKETING SYSTEM</w:t>
             </w:r>
@@ -513,7 +465,6 @@
             <w:r>
               <w:rPr>
                 <w:b/>
-                <w:sz w:val="20"/>
               </w:rPr>
               <w:t>Web Developer</w:t>
             </w:r>
@@ -536,7 +487,7 @@
               <w:jc w:val="right"/>
             </w:pPr>
             <w:r>
-              <w:t xml:space="preserve">Mar 2024 – May 2024</w:t>
+              <w:t>Mar 2024 – May 2024</w:t>
             </w:r>
           </w:p>
         </w:tc>
@@ -545,14 +496,11 @@
     <w:p>
       <w:pPr>
         <w:pStyle w:val="ListBullet"/>
-        <w:spacing w:after="20" w:line="240" w:lineRule="auto"/>
+        <w:spacing w:after="20"/>
         <w:ind w:left="230" w:hanging="187"/>
       </w:pPr>
       <w:r>
-        <w:rPr>
-          <w:sz w:val="20"/>
-        </w:rPr>
-        <w:t xml:space="preserve">Developed a movie ticketing system using ASP.NET (C#) with an MS Access (MDB) database, featuring ticket booking and movie distributor management.</w:t>
+        <w:t>Developed a movie ticketing system using ASP.NET (C#) with an MS Access (MDB) database, featuring ticket booking and movie distributor management.</w:t>
       </w:r>
     </w:p>
     <w:p>
@@ -614,7 +562,6 @@
             <w:r>
               <w:rPr>
                 <w:b/>
-                <w:sz w:val="20"/>
               </w:rPr>
               <w:t>MAPÚA MALAYAN COLLEGES LAGUNA</w:t>
             </w:r>
@@ -642,7 +589,6 @@
             <w:r>
               <w:rPr>
                 <w:b/>
-                <w:sz w:val="20"/>
               </w:rPr>
               <w:t>Bachelor of Science in Information Technology</w:t>
             </w:r>
@@ -809,7 +755,7 @@
               <w:ind w:left="202" w:hanging="173"/>
             </w:pPr>
             <w:r>
-              <w:t xml:space="preserve">CISCO, CCNA: Introduction to Networks | 2022</w:t>
+              <w:t>CISCO, CCNA: Introduction to Networks | 2022</w:t>
             </w:r>
           </w:p>
         </w:tc>
@@ -830,7 +776,7 @@
               <w:ind w:left="202" w:hanging="173"/>
             </w:pPr>
             <w:r>
-              <w:t xml:space="preserve">AWS Academy Graduate - AWS Academy Cloud Foundations | 2023</w:t>
+              <w:t>AWS Academy Graduate - AWS Academy Cloud Foundations | 2023</w:t>
             </w:r>
           </w:p>
         </w:tc>
@@ -857,7 +803,7 @@
               <w:ind w:left="202" w:hanging="173"/>
             </w:pPr>
             <w:r>
-              <w:t xml:space="preserve">Introduction to Computing | 2024</w:t>
+              <w:t>Introduction to Computing | 2024</w:t>
             </w:r>
           </w:p>
         </w:tc>
@@ -878,7 +824,7 @@
               <w:ind w:left="202" w:hanging="173"/>
             </w:pPr>
             <w:r>
-              <w:t xml:space="preserve">Generative AI | 2024</w:t>
+              <w:t>Generative AI | 2024</w:t>
             </w:r>
           </w:p>
         </w:tc>
@@ -905,7 +851,7 @@
               <w:ind w:left="202" w:hanging="173"/>
             </w:pPr>
             <w:r>
-              <w:t xml:space="preserve">Introduction to Cloud Computing | 2024</w:t>
+              <w:t>Introduction to Cloud Computing | 2024</w:t>
             </w:r>
           </w:p>
         </w:tc>
@@ -926,7 +872,7 @@
               <w:ind w:left="202" w:hanging="173"/>
             </w:pPr>
             <w:r>
-              <w:t xml:space="preserve">WearOS: Emerging Technology for Internet and Learning of Everything | 2024</w:t>
+              <w:t>WearOS: Emerging Technology for Internet and Learning of Everything | 2024</w:t>
             </w:r>
           </w:p>
         </w:tc>
@@ -953,7 +899,7 @@
               <w:ind w:left="202" w:hanging="173"/>
             </w:pPr>
             <w:r>
-              <w:t xml:space="preserve">Introduction to Edge Computing | 2024</w:t>
+              <w:t>Introduction to Edge Computing | 2024</w:t>
             </w:r>
           </w:p>
         </w:tc>
@@ -974,7 +920,7 @@
               <w:ind w:left="202" w:hanging="173"/>
             </w:pPr>
             <w:r>
-              <w:t xml:space="preserve">AI Summit: Unlocking the Future - Artificial Intelligence Opportunities | 2024</w:t>
+              <w:t>AI Summit: Unlocking the Future - Artificial Intelligence Opportunities | 2024</w:t>
             </w:r>
           </w:p>
         </w:tc>
@@ -993,12 +939,12 @@
           <w:b/>
           <w:sz w:val="22"/>
         </w:rPr>
-        <w:t xml:space="preserve">SKILLS AND EXPERTISE</w:t>
+        <w:t>SKILLS AND EXPERTISE</w:t>
       </w:r>
     </w:p>
     <w:p>
       <w:pPr>
-        <w:spacing w:after="20" w:line="240" w:lineRule="auto"/>
+        <w:spacing w:after="20"/>
       </w:pPr>
       <w:r>
         <w:rPr>
@@ -1123,7 +1069,7 @@
     </w:tbl>
     <w:p>
       <w:pPr>
-        <w:spacing w:before="0" w:after="0" w:line="40" w:lineRule="exact"/>
+        <w:spacing w:line="40" w:lineRule="exact"/>
       </w:pPr>
     </w:p>
     <w:sectPr>
@@ -1956,8 +1902,6 @@
     <w:rPr>
       <w:rFonts w:asciiTheme="majorHAnsi" w:eastAsiaTheme="majorEastAsia" w:hAnsiTheme="majorHAnsi" w:cstheme="majorBidi"/>
       <w:color w:val="4F81BD" w:themeColor="accent1"/>
-      <w:sz w:val="20"/>
-      <w:szCs w:val="20"/>
     </w:rPr>
   </w:style>
   <w:style w:type="paragraph" w:styleId="Heading9">
@@ -1981,8 +1925,6 @@
       <w:i/>
       <w:iCs/>
       <w:color w:val="404040" w:themeColor="text1" w:themeTint="BF"/>
-      <w:sz w:val="20"/>
-      <w:szCs w:val="20"/>
     </w:rPr>
   </w:style>
   <w:style w:type="character" w:default="1" w:styleId="DefaultParagraphFont">

</xml_diff>

<commit_message>
Add verified downloadable certificates
</commit_message>
<xml_diff>
--- a/portfolio-content/cv/Vincent-Trayvilla-Final-CV.docx
+++ b/portfolio-content/cv/Vincent-Trayvilla-Final-CV.docx
@@ -755,7 +755,7 @@
               <w:ind w:left="202" w:hanging="173"/>
             </w:pPr>
             <w:r>
-              <w:t>CISCO, CCNA: Introduction to Networks | 2022</w:t>
+              <w:t>CCNA: Introduction to Networks | Nov 15, 2022</w:t>
             </w:r>
           </w:p>
         </w:tc>
@@ -776,7 +776,7 @@
               <w:ind w:left="202" w:hanging="173"/>
             </w:pPr>
             <w:r>
-              <w:t>AWS Academy Graduate - AWS Academy Cloud Foundations | 2023</w:t>
+              <w:t>Generative AI for Beginners | Nov 2024</w:t>
             </w:r>
           </w:p>
         </w:tc>
@@ -803,7 +803,7 @@
               <w:ind w:left="202" w:hanging="173"/>
             </w:pPr>
             <w:r>
-              <w:t>Introduction to Computing | 2024</w:t>
+              <w:t>Introduction to Cloud Computing | Aug 24, 2024</w:t>
             </w:r>
           </w:p>
         </w:tc>
@@ -824,7 +824,7 @@
               <w:ind w:left="202" w:hanging="173"/>
             </w:pPr>
             <w:r>
-              <w:t>Generative AI | 2024</w:t>
+              <w:t>WearOS: Emerging Technology for Internet and Learning of Everything | Nov 23, 2024</w:t>
             </w:r>
           </w:p>
         </w:tc>
@@ -851,7 +851,7 @@
               <w:ind w:left="202" w:hanging="173"/>
             </w:pPr>
             <w:r>
-              <w:t>Introduction to Cloud Computing | 2024</w:t>
+              <w:t>Introduction to Edge Computing | Aug 31, 2024</w:t>
             </w:r>
           </w:p>
         </w:tc>
@@ -872,7 +872,7 @@
               <w:ind w:left="202" w:hanging="173"/>
             </w:pPr>
             <w:r>
-              <w:t>WearOS: Emerging Technology for Internet and Learning of Everything | 2024</w:t>
+              <w:t>AI Summit: Unlocking the Future | Jun 6, 2024</w:t>
             </w:r>
           </w:p>
         </w:tc>
@@ -899,7 +899,7 @@
               <w:ind w:left="202" w:hanging="173"/>
             </w:pPr>
             <w:r>
-              <w:t>Introduction to Edge Computing | 2024</w:t>
+              <w:t>Career Readiness Toolkit | Apr 21, 2026</w:t>
             </w:r>
           </w:p>
         </w:tc>
@@ -919,9 +919,6 @@
               <w:spacing w:after="20"/>
               <w:ind w:left="202" w:hanging="173"/>
             </w:pPr>
-            <w:r>
-              <w:t>AI Summit: Unlocking the Future - Artificial Intelligence Opportunities | 2024</w:t>
-            </w:r>
           </w:p>
         </w:tc>
       </w:tr>

</xml_diff>